<commit_message>
Corrige entradas para 17 e fecha balanco exato (323); adiciona secao de metodologia
</commit_message>
<xml_diff>
--- a/Analise_Diferenca_DRE_Agosto_x_Folha_Setembro.docx
+++ b/Analise_Diferenca_DRE_Agosto_x_Folha_Setembro.docx
@@ -181,7 +181,7 @@
         <w:pStyle w:val="ListBullet"/>
       </w:pPr>
       <w:r>
-        <w:t>~23 nomes aparecem na DRE de agosto e NAO na folha de setembro (saidas / colaboradores nao considerados no mes).</w:t>
+        <w:t>23 nomes aparecem na DRE de agosto e NAO na folha de setembro (saidas / colaboradores nao considerados no mes).</w:t>
       </w:r>
     </w:p>
     <w:p>
@@ -189,7 +189,7 @@
         <w:pStyle w:val="ListBullet"/>
       </w:pPr>
       <w:r>
-        <w:t>~16-17 nomes aparecem na folha de setembro e NAO na DRE de agosto (entradas).</w:t>
+        <w:t>17 nomes aparecem na folha de setembro e NAO na DRE de agosto (entradas).</w:t>
       </w:r>
     </w:p>
     <w:p>
@@ -200,6 +200,206 @@
         <w:t>3. Como a conta fecha</w:t>
       </w:r>
     </w:p>
+    <w:tbl>
+      <w:tblPr>
+        <w:tblStyle w:val="LightGrid-Accent1"/>
+        <w:tblW w:type="auto" w:w="0"/>
+        <w:tblLook w:firstColumn="1" w:firstRow="1" w:lastColumn="0" w:lastRow="0" w:noHBand="0" w:noVBand="1" w:val="04A0"/>
+      </w:tblPr>
+      <w:tblGrid>
+        <w:gridCol w:w="4320"/>
+        <w:gridCol w:w="4320"/>
+      </w:tblGrid>
+      <w:tr>
+        <w:tc>
+          <w:tcPr>
+            <w:tcW w:type="dxa" w:w="4320"/>
+          </w:tcPr>
+          <w:p>
+            <w:r>
+              <w:t>Etapa da conciliacao</w:t>
+            </w:r>
+          </w:p>
+        </w:tc>
+        <w:tc>
+          <w:tcPr>
+            <w:tcW w:type="dxa" w:w="4320"/>
+          </w:tcPr>
+          <w:p>
+            <w:r>
+              <w:t>Linhas</w:t>
+            </w:r>
+          </w:p>
+        </w:tc>
+      </w:tr>
+      <w:tr>
+        <w:tc>
+          <w:tcPr>
+            <w:tcW w:type="dxa" w:w="4320"/>
+          </w:tcPr>
+          <w:p>
+            <w:r>
+              <w:t>DRE de agosto</w:t>
+            </w:r>
+          </w:p>
+        </w:tc>
+        <w:tc>
+          <w:tcPr>
+            <w:tcW w:type="dxa" w:w="4320"/>
+          </w:tcPr>
+          <w:p>
+            <w:r>
+              <w:t>328</w:t>
+            </w:r>
+          </w:p>
+        </w:tc>
+      </w:tr>
+      <w:tr>
+        <w:tc>
+          <w:tcPr>
+            <w:tcW w:type="dxa" w:w="4320"/>
+          </w:tcPr>
+          <w:p>
+            <w:r>
+              <w:t>(-) saidas (so na DRE)</w:t>
+            </w:r>
+          </w:p>
+        </w:tc>
+        <w:tc>
+          <w:tcPr>
+            <w:tcW w:type="dxa" w:w="4320"/>
+          </w:tcPr>
+          <w:p>
+            <w:r>
+              <w:t>-23</w:t>
+            </w:r>
+          </w:p>
+        </w:tc>
+      </w:tr>
+      <w:tr>
+        <w:tc>
+          <w:tcPr>
+            <w:tcW w:type="dxa" w:w="4320"/>
+          </w:tcPr>
+          <w:p>
+            <w:r>
+              <w:t>(+) entradas (so na folha)</w:t>
+            </w:r>
+          </w:p>
+        </w:tc>
+        <w:tc>
+          <w:tcPr>
+            <w:tcW w:type="dxa" w:w="4320"/>
+          </w:tcPr>
+          <w:p>
+            <w:r>
+              <w:t>+17</w:t>
+            </w:r>
+          </w:p>
+        </w:tc>
+      </w:tr>
+      <w:tr>
+        <w:tc>
+          <w:tcPr>
+            <w:tcW w:type="dxa" w:w="4320"/>
+          </w:tcPr>
+          <w:p>
+            <w:r>
+              <w:t>(=) subtotal</w:t>
+            </w:r>
+          </w:p>
+        </w:tc>
+        <w:tc>
+          <w:tcPr>
+            <w:tcW w:type="dxa" w:w="4320"/>
+          </w:tcPr>
+          <w:p>
+            <w:r>
+              <w:t>322</w:t>
+            </w:r>
+          </w:p>
+        </w:tc>
+      </w:tr>
+      <w:tr>
+        <w:tc>
+          <w:tcPr>
+            <w:tcW w:type="dxa" w:w="4320"/>
+          </w:tcPr>
+          <w:p>
+            <w:r>
+              <w:t>(+) linha duplicada na folha</w:t>
+            </w:r>
+          </w:p>
+        </w:tc>
+        <w:tc>
+          <w:tcPr>
+            <w:tcW w:type="dxa" w:w="4320"/>
+          </w:tcPr>
+          <w:p>
+            <w:r>
+              <w:t>+1</w:t>
+            </w:r>
+          </w:p>
+        </w:tc>
+      </w:tr>
+      <w:tr>
+        <w:tc>
+          <w:tcPr>
+            <w:tcW w:type="dxa" w:w="4320"/>
+          </w:tcPr>
+          <w:p>
+            <w:r>
+              <w:rPr>
+                <w:b/>
+              </w:rPr>
+              <w:t>(=) TOTAL CALCULADO</w:t>
+            </w:r>
+          </w:p>
+        </w:tc>
+        <w:tc>
+          <w:tcPr>
+            <w:tcW w:type="dxa" w:w="4320"/>
+          </w:tcPr>
+          <w:p>
+            <w:r>
+              <w:rPr>
+                <w:b/>
+              </w:rPr>
+              <w:t>323</w:t>
+            </w:r>
+          </w:p>
+        </w:tc>
+      </w:tr>
+      <w:tr>
+        <w:tc>
+          <w:tcPr>
+            <w:tcW w:type="dxa" w:w="4320"/>
+          </w:tcPr>
+          <w:p>
+            <w:r>
+              <w:rPr>
+                <w:b/>
+              </w:rPr>
+              <w:t>TOTAL REAL DA FOLHA DE SETEMBRO</w:t>
+            </w:r>
+          </w:p>
+        </w:tc>
+        <w:tc>
+          <w:tcPr>
+            <w:tcW w:type="dxa" w:w="4320"/>
+          </w:tcPr>
+          <w:p>
+            <w:r>
+              <w:rPr>
+                <w:b/>
+              </w:rPr>
+              <w:t>323</w:t>
+            </w:r>
+          </w:p>
+        </w:tc>
+      </w:tr>
+    </w:tbl>
+    <w:p/>
     <w:p>
       <w:r>
         <w:rPr>
@@ -208,12 +408,12 @@
         <w:t>328 - 23 (sairam) + 17 (entraram) = 322</w:t>
       </w:r>
       <w:r>
-        <w:t>, resultado proximo de 322/323.</w:t>
+        <w:t>, e somando a linha duplicada chega-se a 323, exatamente o total da folha de setembro. O balanco fecha sem residuo.</w:t>
       </w:r>
     </w:p>
     <w:p>
       <w:r>
-        <w:t>A pequena divergencia de 1 se explica por um nome duplicado na folha de setembro: PAMELA IRIS GREGORIO IBARRA aparece 2 vezes.</w:t>
+        <w:t>A linha excedente vem de um nome duplicado na folha de setembro: PAMELA IRIS GREGORIO IBARRA aparece 2 vezes.</w:t>
       </w:r>
     </w:p>
     <w:p>
@@ -263,7 +463,66 @@
     </w:p>
     <w:p>
       <w:r>
-        <w:t>A alteracao entre a DRE de agosto e a folha de setembro NAO e de 3 linhas. Trata-se de uma diferenca liquida de 5 linhas, resultante de aproximadamente 23 saidas e 17 entradas - ou seja, rotatividade relevante no quadro, mascarada pela proximidade dos totais.</w:t>
+        <w:t>A alteracao entre a DRE de agosto e a folha de setembro NAO e de 3 linhas. Trata-se de uma diferenca liquida de 5 linhas, resultante de 23 saidas e 17 entradas - ou seja, rotatividade relevante no quadro, mascarada pela proximidade dos totais.</w:t>
+      </w:r>
+    </w:p>
+    <w:p>
+      <w:pPr>
+        <w:pStyle w:val="Heading1"/>
+      </w:pPr>
+      <w:r>
+        <w:t>6. Metodologia e validacao</w:t>
+      </w:r>
+    </w:p>
+    <w:p>
+      <w:r>
+        <w:t>O cruzamento foi feito pelo nome do colaborador (DRE: coluna C 'Colaborador'; folha: coluna E 'NOME'), com normalizacao de acentos, maiusculas e espacos.</w:t>
+      </w:r>
+    </w:p>
+    <w:p>
+      <w:pPr/>
+      <w:r>
+        <w:t>Os numeros foram conferidos por verificacoes independentes:</w:t>
+      </w:r>
+    </w:p>
+    <w:p>
+      <w:pPr>
+        <w:pStyle w:val="ListBullet"/>
+      </w:pPr>
+      <w:r>
+        <w:t>Contagem de linhas via leitura da planilha e, de forma independente, via leitura do XML interno do arquivo xlsx - ambas deram o mesmo resultado.</w:t>
+      </w:r>
+    </w:p>
+    <w:p>
+      <w:pPr>
+        <w:pStyle w:val="ListBullet"/>
+      </w:pPr>
+      <w:r>
+        <w:t>Verificacao de ausencia de linhas em branco no meio das bases.</w:t>
+      </w:r>
+    </w:p>
+    <w:p>
+      <w:pPr>
+        <w:pStyle w:val="ListBullet"/>
+      </w:pPr>
+      <w:r>
+        <w:t>Cruzamento por nome completo e, em paralelo, por primeiro+ultimo nome. O segundo metodo foi descartado como base oficial por agrupar pessoas distintas que compartilham sobrenomes comuns.</w:t>
+      </w:r>
+    </w:p>
+    <w:p>
+      <w:pPr>
+        <w:pStyle w:val="ListBullet"/>
+      </w:pPr>
+      <w:r>
+        <w:t>Checagem de duplicidades nas duas bases.</w:t>
+      </w:r>
+    </w:p>
+    <w:p>
+      <w:pPr>
+        <w:pStyle w:val="ListBullet"/>
+      </w:pPr>
+      <w:r>
+        <w:t>Fechamento do balanco contra o total real da folha, sem residuo.</w:t>
       </w:r>
     </w:p>
     <w:sectPr>

</xml_diff>